<commit_message>
Fix spacing in project_documentation.docx — normalize bullets, remove empty paragraphs, tighten headings
</commit_message>
<xml_diff>
--- a/sharepoint-docs/project_documentation.docx
+++ b/sharepoint-docs/project_documentation.docx
@@ -55,7 +55,6 @@
         </w:tc>
       </w:tr>
     </w:tbl>
-    <w:p/>
     <w:p>
       <w:pPr>
         <w:jc w:val="left"/>
@@ -72,15 +71,7 @@
     </w:p>
     <w:p>
       <w:pPr>
-        <w:pBdr>
-          <w:bottom w:val="single" w:sz="6" w:space="1" w:color="2E75B6"/>
-        </w:pBdr>
-        <w:spacing w:after="80"/>
-      </w:pPr>
-    </w:p>
-    <w:p>
-      <w:pPr>
-        <w:spacing w:after="240"/>
+        <w:spacing w:after="120"/>
       </w:pPr>
       <w:r>
         <w:rPr>
@@ -146,7 +137,7 @@
     <w:p>
       <w:pPr>
         <w:pStyle w:val="Heading1"/>
-        <w:spacing w:before="280" w:after="80"/>
+        <w:spacing w:before="200" w:after="80"/>
       </w:pPr>
       <w:r>
         <w:rPr>
@@ -187,7 +178,7 @@
     <w:p>
       <w:pPr>
         <w:pStyle w:val="ListBullet"/>
-        <w:spacing w:after="60"/>
+        <w:spacing w:after="80" w:before="0"/>
         <w:ind w:left="720"/>
       </w:pPr>
       <w:r>
@@ -201,7 +192,7 @@
     <w:p>
       <w:pPr>
         <w:pStyle w:val="ListBullet"/>
-        <w:spacing w:after="60"/>
+        <w:spacing w:after="80" w:before="0"/>
         <w:ind w:left="720"/>
       </w:pPr>
       <w:r>
@@ -215,7 +206,7 @@
     <w:p>
       <w:pPr>
         <w:pStyle w:val="ListBullet"/>
-        <w:spacing w:after="60"/>
+        <w:spacing w:after="80" w:before="0"/>
         <w:ind w:left="720"/>
       </w:pPr>
       <w:r>
@@ -229,7 +220,7 @@
     <w:p>
       <w:pPr>
         <w:pStyle w:val="ListBullet"/>
-        <w:spacing w:after="60"/>
+        <w:spacing w:after="80" w:before="0"/>
         <w:ind w:left="720"/>
       </w:pPr>
       <w:r>
@@ -243,7 +234,7 @@
     <w:p>
       <w:pPr>
         <w:pStyle w:val="Heading1"/>
-        <w:spacing w:before="280" w:after="80"/>
+        <w:spacing w:before="200" w:after="80"/>
       </w:pPr>
       <w:r>
         <w:rPr>
@@ -286,7 +277,7 @@
     <w:p>
       <w:pPr>
         <w:pStyle w:val="Heading1"/>
-        <w:spacing w:before="280" w:after="80"/>
+        <w:spacing w:before="200" w:after="80"/>
       </w:pPr>
       <w:r>
         <w:rPr>
@@ -486,7 +477,6 @@
         </w:tc>
       </w:tr>
     </w:tbl>
-    <w:p/>
     <w:p>
       <w:pPr>
         <w:spacing w:after="120"/>
@@ -504,7 +494,7 @@
     <w:p>
       <w:pPr>
         <w:pStyle w:val="ListBullet"/>
-        <w:spacing w:after="60"/>
+        <w:spacing w:after="80" w:before="0"/>
         <w:ind w:left="720"/>
       </w:pPr>
       <w:r>
@@ -518,7 +508,7 @@
     <w:p>
       <w:pPr>
         <w:pStyle w:val="ListBullet"/>
-        <w:spacing w:after="60"/>
+        <w:spacing w:after="80" w:before="0"/>
         <w:ind w:left="720"/>
       </w:pPr>
       <w:r>
@@ -532,7 +522,7 @@
     <w:p>
       <w:pPr>
         <w:pStyle w:val="ListBullet"/>
-        <w:spacing w:after="60"/>
+        <w:spacing w:after="80" w:before="0"/>
         <w:ind w:left="720"/>
       </w:pPr>
       <w:r>
@@ -546,7 +536,7 @@
     <w:p>
       <w:pPr>
         <w:pStyle w:val="ListBullet"/>
-        <w:spacing w:after="60"/>
+        <w:spacing w:after="80" w:before="0"/>
         <w:ind w:left="720"/>
       </w:pPr>
       <w:r>
@@ -560,7 +550,7 @@
     <w:p>
       <w:pPr>
         <w:pStyle w:val="ListBullet"/>
-        <w:spacing w:after="60"/>
+        <w:spacing w:after="80" w:before="0"/>
         <w:ind w:left="720"/>
       </w:pPr>
       <w:r>
@@ -574,7 +564,7 @@
     <w:p>
       <w:pPr>
         <w:pStyle w:val="Heading1"/>
-        <w:spacing w:before="280" w:after="80"/>
+        <w:spacing w:before="200" w:after="80"/>
       </w:pPr>
       <w:r>
         <w:rPr>
@@ -587,7 +577,7 @@
     <w:p>
       <w:pPr>
         <w:pStyle w:val="ListBullet"/>
-        <w:spacing w:after="100"/>
+        <w:spacing w:after="80" w:before="0"/>
       </w:pPr>
       <w:r>
         <w:rPr>
@@ -608,7 +598,7 @@
     <w:p>
       <w:pPr>
         <w:pStyle w:val="ListBullet"/>
-        <w:spacing w:after="100"/>
+        <w:spacing w:after="80" w:before="0"/>
       </w:pPr>
       <w:r>
         <w:rPr>
@@ -629,7 +619,7 @@
     <w:p>
       <w:pPr>
         <w:pStyle w:val="ListBullet"/>
-        <w:spacing w:after="100"/>
+        <w:spacing w:after="80" w:before="0"/>
       </w:pPr>
       <w:r>
         <w:rPr>
@@ -650,7 +640,7 @@
     <w:p>
       <w:pPr>
         <w:pStyle w:val="ListBullet"/>
-        <w:spacing w:after="100"/>
+        <w:spacing w:after="80" w:before="0"/>
       </w:pPr>
       <w:r>
         <w:rPr>
@@ -671,7 +661,7 @@
     <w:p>
       <w:pPr>
         <w:pStyle w:val="ListBullet"/>
-        <w:spacing w:after="100"/>
+        <w:spacing w:after="80" w:before="0"/>
       </w:pPr>
       <w:r>
         <w:rPr>
@@ -692,7 +682,7 @@
     <w:p>
       <w:pPr>
         <w:pStyle w:val="ListBullet"/>
-        <w:spacing w:after="100"/>
+        <w:spacing w:after="80" w:before="0"/>
       </w:pPr>
       <w:r>
         <w:rPr>
@@ -713,7 +703,7 @@
     <w:p>
       <w:pPr>
         <w:pStyle w:val="Heading1"/>
-        <w:spacing w:before="280" w:after="80"/>
+        <w:spacing w:before="200" w:after="80"/>
       </w:pPr>
       <w:r>
         <w:rPr>
@@ -1117,11 +1107,10 @@
         </w:tc>
       </w:tr>
     </w:tbl>
-    <w:p/>
     <w:p>
       <w:pPr>
         <w:pStyle w:val="Heading1"/>
-        <w:spacing w:before="280" w:after="80"/>
+        <w:spacing w:before="200" w:after="80"/>
       </w:pPr>
       <w:r>
         <w:rPr>
@@ -1134,7 +1123,7 @@
     <w:p>
       <w:pPr>
         <w:pStyle w:val="ListBullet"/>
-        <w:spacing w:after="60"/>
+        <w:spacing w:after="80" w:before="0"/>
         <w:ind w:left="720"/>
       </w:pPr>
       <w:r>
@@ -1148,7 +1137,7 @@
     <w:p>
       <w:pPr>
         <w:pStyle w:val="ListBullet"/>
-        <w:spacing w:after="60"/>
+        <w:spacing w:after="80" w:before="0"/>
         <w:ind w:left="720"/>
       </w:pPr>
       <w:r>
@@ -1162,7 +1151,7 @@
     <w:p>
       <w:pPr>
         <w:pStyle w:val="ListBullet"/>
-        <w:spacing w:after="60"/>
+        <w:spacing w:after="80" w:before="0"/>
         <w:ind w:left="720"/>
       </w:pPr>
       <w:r>
@@ -1176,7 +1165,7 @@
     <w:p>
       <w:pPr>
         <w:pStyle w:val="ListBullet"/>
-        <w:spacing w:after="60"/>
+        <w:spacing w:after="80" w:before="0"/>
         <w:ind w:left="720"/>
       </w:pPr>
       <w:r>
@@ -1190,7 +1179,7 @@
     <w:p>
       <w:pPr>
         <w:pStyle w:val="ListBullet"/>
-        <w:spacing w:after="60"/>
+        <w:spacing w:after="80" w:before="0"/>
         <w:ind w:left="720"/>
       </w:pPr>
       <w:r>
@@ -1204,7 +1193,7 @@
     <w:p>
       <w:pPr>
         <w:pStyle w:val="ListBullet"/>
-        <w:spacing w:after="60"/>
+        <w:spacing w:after="80" w:before="0"/>
         <w:ind w:left="720"/>
       </w:pPr>
       <w:r>
@@ -1214,14 +1203,6 @@
         </w:rPr>
         <w:t>Publish Tableau dashboard to Tableau Public and link from SharePoint project page</w:t>
       </w:r>
-    </w:p>
-    <w:p>
-      <w:pPr>
-        <w:pBdr>
-          <w:bottom w:val="single" w:sz="6" w:space="1" w:color="CCCCCC"/>
-        </w:pBdr>
-        <w:spacing w:after="80"/>
-      </w:pPr>
     </w:p>
     <w:p>
       <w:pPr>

</xml_diff>

<commit_message>
Remove confidential footer from project_documentation.docx
</commit_message>
<xml_diff>
--- a/sharepoint-docs/project_documentation.docx
+++ b/sharepoint-docs/project_documentation.docx
@@ -1204,19 +1204,6 @@
         <w:t>Publish Tableau dashboard to Tableau Public and link from SharePoint project page</w:t>
       </w:r>
     </w:p>
-    <w:p>
-      <w:pPr>
-        <w:jc w:val="center"/>
-      </w:pPr>
-      <w:r>
-        <w:rPr>
-          <w:rFonts w:ascii="Arial" w:hAnsi="Arial"/>
-          <w:color w:val="7F7F7F"/>
-          <w:sz w:val="17"/>
-        </w:rPr>
-        <w:t>Confidential – Internal Use Only  ·  Neha Sinha  ·  June 2026</w:t>
-      </w:r>
-    </w:p>
     <w:sectPr>
       <w:pgSz w:w="12240" w:h="15840"/>
       <w:pgMar w:top="1440" w:right="1800" w:bottom="1440" w:left="1800" w:header="720" w:footer="720" w:gutter="0"/>

</xml_diff>